<commit_message>
Update Changes made timeline.docx
</commit_message>
<xml_diff>
--- a/Dcoumentation/Additional Material/Changes made timeline.docx
+++ b/Dcoumentation/Additional Material/Changes made timeline.docx
@@ -105,7 +105,7 @@
       <w:r>
         <w:t>(</w:t>
       </w:r>
-      <w:hyperlink r:id="rId4" w:history="1">
+      <w:hyperlink r:id="rId5" w:history="1">
         <w:r>
           <w:rPr>
             <w:rStyle w:val="Hyperlink"/>
@@ -187,9 +187,514 @@
         <w:t xml:space="preserve">This is adequate for development and small testing, but not for running the benchmark as an integrated environment, which needs on the order of 16GB of RAM and several hundred GB of storage simultaneously. </w:t>
       </w:r>
       <w:r>
-        <w:t xml:space="preserve">AWS resolves this by providing a machine sized to the benchmarks actual footprint. </w:t>
-      </w:r>
-    </w:p>
+        <w:t xml:space="preserve">AWS resolves this by providing a machine sized to the </w:t>
+      </w:r>
+      <w:r>
+        <w:t>benchmark’s</w:t>
+      </w:r>
+      <w:r>
+        <w:t xml:space="preserve"> actual footprint</w:t>
+      </w:r>
+      <w:r>
+        <w:t xml:space="preserve"> and the pre-built AMI removes the effort of installing and configuring each site by hand. </w:t>
+      </w:r>
+      <w:r>
+        <w:t xml:space="preserve">For a comparative study this also matters methodologically where a fixed cloud image gives a stable, reproducible environment, so measured differences between the orchestration strategies are </w:t>
+      </w:r>
+      <w:r>
+        <w:t xml:space="preserve">attributable to the agents rather than to environmental drift. </w:t>
+      </w:r>
+    </w:p>
+    <w:p/>
+    <w:p>
+      <w:pPr>
+        <w:rPr>
+          <w:b/>
+          <w:bCs/>
+        </w:rPr>
+      </w:pPr>
+      <w:r>
+        <w:rPr>
+          <w:b/>
+          <w:bCs/>
+        </w:rPr>
+        <w:t>How I will use it and what will be tested</w:t>
+      </w:r>
+    </w:p>
+    <w:p>
+      <w:r>
+        <w:t>Talk about testing how much tokens it uses for OpenAI API</w:t>
+      </w:r>
+      <w:r>
+        <w:t xml:space="preserve"> (pricing per task)</w:t>
+      </w:r>
+      <w:r>
+        <w:t xml:space="preserve"> &amp; time it takes to run a few tasks for a few websites. </w:t>
+      </w:r>
+    </w:p>
+    <w:p/>
+    <w:p>
+      <w:pPr>
+        <w:pStyle w:val="IntenseQuote"/>
+        <w:rPr>
+          <w:b/>
+          <w:bCs/>
+          <w:color w:val="auto"/>
+          <w:sz w:val="28"/>
+          <w:szCs w:val="28"/>
+        </w:rPr>
+      </w:pPr>
+      <w:r>
+        <w:rPr>
+          <w:b/>
+          <w:bCs/>
+          <w:color w:val="auto"/>
+          <w:sz w:val="28"/>
+          <w:szCs w:val="28"/>
+        </w:rPr>
+        <w:lastRenderedPageBreak/>
+        <w:t>(</w:t>
+      </w:r>
+      <w:r>
+        <w:rPr>
+          <w:b/>
+          <w:bCs/>
+          <w:color w:val="auto"/>
+          <w:sz w:val="28"/>
+          <w:szCs w:val="28"/>
+        </w:rPr>
+        <w:t>10</w:t>
+      </w:r>
+      <w:r>
+        <w:rPr>
+          <w:b/>
+          <w:bCs/>
+          <w:color w:val="auto"/>
+          <w:sz w:val="28"/>
+          <w:szCs w:val="28"/>
+          <w:vertAlign w:val="superscript"/>
+        </w:rPr>
+        <w:t>th</w:t>
+      </w:r>
+      <w:r>
+        <w:rPr>
+          <w:b/>
+          <w:bCs/>
+          <w:color w:val="auto"/>
+          <w:sz w:val="28"/>
+          <w:szCs w:val="28"/>
+        </w:rPr>
+        <w:t xml:space="preserve"> </w:t>
+      </w:r>
+      <w:r>
+        <w:rPr>
+          <w:b/>
+          <w:bCs/>
+          <w:color w:val="auto"/>
+          <w:sz w:val="28"/>
+          <w:szCs w:val="28"/>
+        </w:rPr>
+        <w:t>July</w:t>
+      </w:r>
+      <w:r>
+        <w:rPr>
+          <w:b/>
+          <w:bCs/>
+          <w:color w:val="auto"/>
+          <w:sz w:val="28"/>
+          <w:szCs w:val="28"/>
+        </w:rPr>
+        <w:t>)</w:t>
+      </w:r>
+    </w:p>
+    <w:p>
+      <w:r>
+        <w:t xml:space="preserve">I started this AWS course to provide the foundations </w:t>
+      </w:r>
+      <w:r>
+        <w:t>for using AWS services for this project</w:t>
+      </w:r>
+      <w:r>
+        <w:t xml:space="preserve"> (specifically using the EC2 service provides by AWS)</w:t>
+      </w:r>
+      <w:r>
+        <w:t>. I will be noting down what I’ve learnt from this course (</w:t>
+      </w:r>
+      <w:r>
+        <w:t xml:space="preserve">I don’t need to specify what </w:t>
+      </w:r>
+      <w:proofErr w:type="spellStart"/>
+      <w:r>
+        <w:t>ive</w:t>
+      </w:r>
+      <w:proofErr w:type="spellEnd"/>
+      <w:r>
+        <w:t xml:space="preserve"> learnt in the report, just mention the certification of completion</w:t>
+      </w:r>
+      <w:r>
+        <w:t xml:space="preserve"> as its related </w:t>
+      </w:r>
+      <w:r>
+        <w:t>to this dissertation topic</w:t>
+      </w:r>
+      <w:r>
+        <w:t>)</w:t>
+      </w:r>
+    </w:p>
+    <w:p>
+      <w:r>
+        <w:t xml:space="preserve">I setup the AWS instance </w:t>
+      </w:r>
+      <w:r>
+        <w:t xml:space="preserve">with these exact settings following the </w:t>
+      </w:r>
+      <w:proofErr w:type="spellStart"/>
+      <w:r>
+        <w:t>WebArena</w:t>
+      </w:r>
+      <w:proofErr w:type="spellEnd"/>
+      <w:r>
+        <w:t xml:space="preserve"> repository </w:t>
+      </w:r>
+      <w:proofErr w:type="spellStart"/>
+      <w:r>
+        <w:t>readMe</w:t>
+      </w:r>
+      <w:proofErr w:type="spellEnd"/>
+      <w:r>
+        <w:t xml:space="preserve"> EC2 setup instructions:</w:t>
+      </w:r>
+    </w:p>
+    <w:p>
+      <w:r>
+        <w:t>This is a summary of the instance settings</w:t>
+      </w:r>
+    </w:p>
+    <w:p>
+      <w:r>
+        <w:rPr>
+          <w:noProof/>
+        </w:rPr>
+        <w:drawing>
+          <wp:inline distT="0" distB="0" distL="0" distR="0" wp14:anchorId="1A94D143" wp14:editId="61DB3C90">
+            <wp:extent cx="3448050" cy="3308862"/>
+            <wp:effectExtent l="0" t="0" r="0" b="6350"/>
+            <wp:docPr id="1303934155" name="Picture 1"/>
+            <wp:cNvGraphicFramePr>
+              <a:graphicFrameLocks xmlns:a="http://schemas.openxmlformats.org/drawingml/2006/main" noChangeAspect="1"/>
+            </wp:cNvGraphicFramePr>
+            <a:graphic xmlns:a="http://schemas.openxmlformats.org/drawingml/2006/main">
+              <a:graphicData uri="http://schemas.openxmlformats.org/drawingml/2006/picture">
+                <pic:pic xmlns:pic="http://schemas.openxmlformats.org/drawingml/2006/picture">
+                  <pic:nvPicPr>
+                    <pic:cNvPr id="1303934155" name=""/>
+                    <pic:cNvPicPr/>
+                  </pic:nvPicPr>
+                  <pic:blipFill>
+                    <a:blip r:embed="rId6"/>
+                    <a:stretch>
+                      <a:fillRect/>
+                    </a:stretch>
+                  </pic:blipFill>
+                  <pic:spPr>
+                    <a:xfrm>
+                      <a:off x="0" y="0"/>
+                      <a:ext cx="3453707" cy="3314291"/>
+                    </a:xfrm>
+                    <a:prstGeom prst="rect">
+                      <a:avLst/>
+                    </a:prstGeom>
+                  </pic:spPr>
+                </pic:pic>
+              </a:graphicData>
+            </a:graphic>
+          </wp:inline>
+        </w:drawing>
+      </w:r>
+    </w:p>
+    <w:p>
+      <w:r>
+        <w:t>This is the in</w:t>
+      </w:r>
+      <w:r>
+        <w:t xml:space="preserve">stance type that is recommended by the </w:t>
+      </w:r>
+      <w:proofErr w:type="spellStart"/>
+      <w:r>
+        <w:t>webarena</w:t>
+      </w:r>
+      <w:proofErr w:type="spellEnd"/>
+      <w:r>
+        <w:t xml:space="preserve"> repo readme</w:t>
+      </w:r>
+      <w:r>
+        <w:t xml:space="preserve">. </w:t>
+      </w:r>
+    </w:p>
+    <w:p>
+      <w:r>
+        <w:rPr>
+          <w:noProof/>
+        </w:rPr>
+        <w:drawing>
+          <wp:inline distT="0" distB="0" distL="0" distR="0" wp14:anchorId="4304D663" wp14:editId="1F682611">
+            <wp:extent cx="5731510" cy="1115695"/>
+            <wp:effectExtent l="0" t="0" r="2540" b="8255"/>
+            <wp:docPr id="1097482263" name="Picture 1"/>
+            <wp:cNvGraphicFramePr>
+              <a:graphicFrameLocks xmlns:a="http://schemas.openxmlformats.org/drawingml/2006/main" noChangeAspect="1"/>
+            </wp:cNvGraphicFramePr>
+            <a:graphic xmlns:a="http://schemas.openxmlformats.org/drawingml/2006/main">
+              <a:graphicData uri="http://schemas.openxmlformats.org/drawingml/2006/picture">
+                <pic:pic xmlns:pic="http://schemas.openxmlformats.org/drawingml/2006/picture">
+                  <pic:nvPicPr>
+                    <pic:cNvPr id="1097482263" name=""/>
+                    <pic:cNvPicPr/>
+                  </pic:nvPicPr>
+                  <pic:blipFill>
+                    <a:blip r:embed="rId7"/>
+                    <a:stretch>
+                      <a:fillRect/>
+                    </a:stretch>
+                  </pic:blipFill>
+                  <pic:spPr>
+                    <a:xfrm>
+                      <a:off x="0" y="0"/>
+                      <a:ext cx="5731510" cy="1115695"/>
+                    </a:xfrm>
+                    <a:prstGeom prst="rect">
+                      <a:avLst/>
+                    </a:prstGeom>
+                  </pic:spPr>
+                </pic:pic>
+              </a:graphicData>
+            </a:graphic>
+          </wp:inline>
+        </w:drawing>
+      </w:r>
+    </w:p>
+    <w:p/>
+    <w:p/>
+    <w:p/>
+    <w:p/>
+    <w:p>
+      <w:r>
+        <w:lastRenderedPageBreak/>
+        <w:t>I set the key pair to “</w:t>
+      </w:r>
+      <w:proofErr w:type="spellStart"/>
+      <w:r>
+        <w:t>webarena</w:t>
+      </w:r>
+      <w:proofErr w:type="spellEnd"/>
+      <w:r>
+        <w:t xml:space="preserve">-key” (which is a public key) to encrypt and decrypt login information. </w:t>
+      </w:r>
+      <w:r>
+        <w:t>This allows me and only me to log into the instance when launching the instance.</w:t>
+      </w:r>
+      <w:r>
+        <w:t xml:space="preserve"> Once I set it, it </w:t>
+      </w:r>
+      <w:r>
+        <w:t>generated</w:t>
+      </w:r>
+      <w:r>
+        <w:t xml:space="preserve"> the private key (a .</w:t>
+      </w:r>
+      <w:proofErr w:type="spellStart"/>
+      <w:r>
+        <w:t>pem</w:t>
+      </w:r>
+      <w:proofErr w:type="spellEnd"/>
+      <w:r>
+        <w:t xml:space="preserve"> file) containing this key. </w:t>
+      </w:r>
+    </w:p>
+    <w:p>
+      <w:r>
+        <w:rPr>
+          <w:noProof/>
+        </w:rPr>
+        <w:drawing>
+          <wp:inline distT="0" distB="0" distL="0" distR="0" wp14:anchorId="64B45E5D" wp14:editId="6E774332">
+            <wp:extent cx="5731510" cy="935355"/>
+            <wp:effectExtent l="0" t="0" r="2540" b="0"/>
+            <wp:docPr id="1784642234" name="Picture 1"/>
+            <wp:cNvGraphicFramePr>
+              <a:graphicFrameLocks xmlns:a="http://schemas.openxmlformats.org/drawingml/2006/main" noChangeAspect="1"/>
+            </wp:cNvGraphicFramePr>
+            <a:graphic xmlns:a="http://schemas.openxmlformats.org/drawingml/2006/main">
+              <a:graphicData uri="http://schemas.openxmlformats.org/drawingml/2006/picture">
+                <pic:pic xmlns:pic="http://schemas.openxmlformats.org/drawingml/2006/picture">
+                  <pic:nvPicPr>
+                    <pic:cNvPr id="1784642234" name=""/>
+                    <pic:cNvPicPr/>
+                  </pic:nvPicPr>
+                  <pic:blipFill>
+                    <a:blip r:embed="rId8"/>
+                    <a:stretch>
+                      <a:fillRect/>
+                    </a:stretch>
+                  </pic:blipFill>
+                  <pic:spPr>
+                    <a:xfrm>
+                      <a:off x="0" y="0"/>
+                      <a:ext cx="5731510" cy="935355"/>
+                    </a:xfrm>
+                    <a:prstGeom prst="rect">
+                      <a:avLst/>
+                    </a:prstGeom>
+                  </pic:spPr>
+                </pic:pic>
+              </a:graphicData>
+            </a:graphic>
+          </wp:inline>
+        </w:drawing>
+      </w:r>
+    </w:p>
+    <w:p/>
+    <w:p>
+      <w:r>
+        <w:t>When configuring the network settings, I wanted to test the instance by only selecting the websites and their paired port numbers</w:t>
+      </w:r>
+      <w:r>
+        <w:t>. To which</w:t>
+      </w:r>
+      <w:r>
+        <w:t xml:space="preserve"> I added </w:t>
+      </w:r>
+      <w:r>
+        <w:t xml:space="preserve">a few inbound rules; </w:t>
+      </w:r>
+    </w:p>
+    <w:p>
+      <w:pPr>
+        <w:pStyle w:val="ListParagraph"/>
+        <w:numPr>
+          <w:ilvl w:val="0"/>
+          <w:numId w:val="1"/>
+        </w:numPr>
+      </w:pPr>
+      <w:r>
+        <w:t>ssh with port 22</w:t>
+      </w:r>
+      <w:r>
+        <w:t xml:space="preserve"> and the </w:t>
+      </w:r>
+      <w:proofErr w:type="gramStart"/>
+      <w:r>
+        <w:t xml:space="preserve">source </w:t>
+      </w:r>
+      <w:r>
+        <w:t xml:space="preserve"> </w:t>
+      </w:r>
+      <w:r>
+        <w:t>IP</w:t>
+      </w:r>
+      <w:proofErr w:type="gramEnd"/>
+      <w:r>
+        <w:t xml:space="preserve"> being my IP</w:t>
+      </w:r>
+      <w:r>
+        <w:t xml:space="preserve"> (I used my IP for SSH only for security purposes)</w:t>
+      </w:r>
+    </w:p>
+    <w:p>
+      <w:pPr>
+        <w:pStyle w:val="ListParagraph"/>
+        <w:numPr>
+          <w:ilvl w:val="0"/>
+          <w:numId w:val="1"/>
+        </w:numPr>
+      </w:pPr>
+      <w:r>
+        <w:t>custom TCP with a port of 7770 and a source IP of anywhere (</w:t>
+      </w:r>
+      <w:r>
+        <w:t>since I don’t have any sensitive information travelling the network I set it to anywhere)</w:t>
+      </w:r>
+      <w:r>
+        <w:t>, this is for the shopping website.</w:t>
+      </w:r>
+    </w:p>
+    <w:p>
+      <w:pPr>
+        <w:pStyle w:val="ListParagraph"/>
+        <w:numPr>
+          <w:ilvl w:val="0"/>
+          <w:numId w:val="1"/>
+        </w:numPr>
+      </w:pPr>
+      <w:r>
+        <w:t xml:space="preserve">Custom TCP with a port of 7780 and a source IP of anywhere, this is for the CMS/shopping admin sites. </w:t>
+      </w:r>
+    </w:p>
+    <w:p>
+      <w:pPr>
+        <w:pStyle w:val="ListParagraph"/>
+        <w:numPr>
+          <w:ilvl w:val="0"/>
+          <w:numId w:val="1"/>
+        </w:numPr>
+      </w:pPr>
+      <w:r>
+        <w:t>Custom TCP with a port of 9999 and a source IP of anywhere, this is for the Forum sites (reddit/</w:t>
+      </w:r>
+      <w:proofErr w:type="spellStart"/>
+      <w:r>
+        <w:t>postmill</w:t>
+      </w:r>
+      <w:proofErr w:type="spellEnd"/>
+      <w:r>
+        <w:t>)</w:t>
+      </w:r>
+    </w:p>
+    <w:p/>
+    <w:p>
+      <w:r>
+        <w:rPr>
+          <w:noProof/>
+        </w:rPr>
+        <w:lastRenderedPageBreak/>
+        <w:drawing>
+          <wp:inline distT="0" distB="0" distL="0" distR="0" wp14:anchorId="0653243F" wp14:editId="2F0BE4AC">
+            <wp:extent cx="4715024" cy="4400550"/>
+            <wp:effectExtent l="0" t="0" r="9525" b="0"/>
+            <wp:docPr id="1225428067" name="Picture 1"/>
+            <wp:cNvGraphicFramePr>
+              <a:graphicFrameLocks xmlns:a="http://schemas.openxmlformats.org/drawingml/2006/main" noChangeAspect="1"/>
+            </wp:cNvGraphicFramePr>
+            <a:graphic xmlns:a="http://schemas.openxmlformats.org/drawingml/2006/main">
+              <a:graphicData uri="http://schemas.openxmlformats.org/drawingml/2006/picture">
+                <pic:pic xmlns:pic="http://schemas.openxmlformats.org/drawingml/2006/picture">
+                  <pic:nvPicPr>
+                    <pic:cNvPr id="1225428067" name=""/>
+                    <pic:cNvPicPr/>
+                  </pic:nvPicPr>
+                  <pic:blipFill>
+                    <a:blip r:embed="rId9"/>
+                    <a:stretch>
+                      <a:fillRect/>
+                    </a:stretch>
+                  </pic:blipFill>
+                  <pic:spPr>
+                    <a:xfrm>
+                      <a:off x="0" y="0"/>
+                      <a:ext cx="4717497" cy="4402858"/>
+                    </a:xfrm>
+                    <a:prstGeom prst="rect">
+                      <a:avLst/>
+                    </a:prstGeom>
+                  </pic:spPr>
+                </pic:pic>
+              </a:graphicData>
+            </a:graphic>
+          </wp:inline>
+        </w:drawing>
+      </w:r>
+    </w:p>
+    <w:p/>
     <w:sectPr>
       <w:pgSz w:w="11906" w:h="16838"/>
       <w:pgMar w:top="1440" w:right="1440" w:bottom="1440" w:left="1440" w:header="708" w:footer="708" w:gutter="0"/>
@@ -198,6 +703,127 @@
     </w:sectPr>
   </w:body>
 </w:document>
+</file>
+
+<file path=word/numbering.xml><?xml version="1.0" encoding="utf-8"?>
+<w:numbering xmlns:wpc="http://schemas.microsoft.com/office/word/2010/wordprocessingCanvas" xmlns:cx="http://schemas.microsoft.com/office/drawing/2014/chartex" xmlns:cx1="http://schemas.microsoft.com/office/drawing/2015/9/8/chartex" xmlns:cx2="http://schemas.microsoft.com/office/drawing/2015/10/21/chartex" xmlns:cx3="http://schemas.microsoft.com/office/drawing/2016/5/9/chartex" xmlns:cx4="http://schemas.microsoft.com/office/drawing/2016/5/10/chartex" xmlns:cx5="http://schemas.microsoft.com/office/drawing/2016/5/11/chartex" xmlns:cx6="http://schemas.microsoft.com/office/drawing/2016/5/12/chartex" xmlns:cx7="http://schemas.microsoft.com/office/drawing/2016/5/13/chartex" xmlns:cx8="http://schemas.microsoft.com/office/drawing/2016/5/14/chartex" xmlns:mc="http://schemas.openxmlformats.org/markup-compatibility/2006" xmlns:aink="http://schemas.microsoft.com/office/drawing/2016/ink" xmlns:am3d="http://schemas.microsoft.com/office/drawing/2017/model3d" xmlns:o="urn:schemas-microsoft-com:office:office" xmlns:oel="http://schemas.microsoft.com/office/2019/extlst" xmlns:r="http://schemas.openxmlformats.org/officeDocument/2006/relationships" xmlns:m="http://schemas.openxmlformats.org/officeDocument/2006/math" xmlns:v="urn:schemas-microsoft-com:vml" xmlns:wp14="http://schemas.microsoft.com/office/word/2010/wordprocessingDrawing" xmlns:wp="http://schemas.openxmlformats.org/drawingml/2006/wordprocessingDrawing" xmlns:w10="urn:schemas-microsoft-com:office:word" xmlns:w="http://schemas.openxmlformats.org/wordprocessingml/2006/main" xmlns:w14="http://schemas.microsoft.com/office/word/2010/wordml" xmlns:w15="http://schemas.microsoft.com/office/word/2012/wordml" xmlns:w16cex="http://schemas.microsoft.com/office/word/2018/wordml/cex" xmlns:w16cid="http://schemas.microsoft.com/office/word/2016/wordml/cid" xmlns:w16="http://schemas.microsoft.com/office/word/2018/wordml" xmlns:w16du="http://schemas.microsoft.com/office/word/2023/wordml/word16du" xmlns:w16sdtdh="http://schemas.microsoft.com/office/word/2020/wordml/sdtdatahash" xmlns:w16sdtfl="http://schemas.microsoft.com/office/word/2024/wordml/sdtformatlock" xmlns:w16se="http://schemas.microsoft.com/office/word/2015/wordml/symex" xmlns:wpg="http://schemas.microsoft.com/office/word/2010/wordprocessingGroup" xmlns:wpi="http://schemas.microsoft.com/office/word/2010/wordprocessingInk" xmlns:wne="http://schemas.microsoft.com/office/word/2006/wordml" xmlns:wps="http://schemas.microsoft.com/office/word/2010/wordprocessingShape" mc:Ignorable="w14 w15 w16se w16cid w16 w16cex w16sdtdh w16sdtfl w16du wp14">
+  <w:abstractNum w:abstractNumId="0" w15:restartNumberingAfterBreak="0">
+    <w:nsid w:val="5B441A96"/>
+    <w:multiLevelType w:val="hybridMultilevel"/>
+    <w:tmpl w:val="2DD6B85C"/>
+    <w:lvl w:ilvl="0" w:tplc="08090001">
+      <w:start w:val="1"/>
+      <w:numFmt w:val="bullet"/>
+      <w:lvlText w:val=""/>
+      <w:lvlJc w:val="left"/>
+      <w:pPr>
+        <w:ind w:left="720" w:hanging="360"/>
+      </w:pPr>
+      <w:rPr>
+        <w:rFonts w:ascii="Symbol" w:hAnsi="Symbol" w:hint="default"/>
+      </w:rPr>
+    </w:lvl>
+    <w:lvl w:ilvl="1" w:tplc="08090003" w:tentative="1">
+      <w:start w:val="1"/>
+      <w:numFmt w:val="bullet"/>
+      <w:lvlText w:val="o"/>
+      <w:lvlJc w:val="left"/>
+      <w:pPr>
+        <w:ind w:left="1440" w:hanging="360"/>
+      </w:pPr>
+      <w:rPr>
+        <w:rFonts w:ascii="Courier New" w:hAnsi="Courier New" w:cs="Courier New" w:hint="default"/>
+      </w:rPr>
+    </w:lvl>
+    <w:lvl w:ilvl="2" w:tplc="08090005" w:tentative="1">
+      <w:start w:val="1"/>
+      <w:numFmt w:val="bullet"/>
+      <w:lvlText w:val=""/>
+      <w:lvlJc w:val="left"/>
+      <w:pPr>
+        <w:ind w:left="2160" w:hanging="360"/>
+      </w:pPr>
+      <w:rPr>
+        <w:rFonts w:ascii="Wingdings" w:hAnsi="Wingdings" w:hint="default"/>
+      </w:rPr>
+    </w:lvl>
+    <w:lvl w:ilvl="3" w:tplc="08090001" w:tentative="1">
+      <w:start w:val="1"/>
+      <w:numFmt w:val="bullet"/>
+      <w:lvlText w:val=""/>
+      <w:lvlJc w:val="left"/>
+      <w:pPr>
+        <w:ind w:left="2880" w:hanging="360"/>
+      </w:pPr>
+      <w:rPr>
+        <w:rFonts w:ascii="Symbol" w:hAnsi="Symbol" w:hint="default"/>
+      </w:rPr>
+    </w:lvl>
+    <w:lvl w:ilvl="4" w:tplc="08090003" w:tentative="1">
+      <w:start w:val="1"/>
+      <w:numFmt w:val="bullet"/>
+      <w:lvlText w:val="o"/>
+      <w:lvlJc w:val="left"/>
+      <w:pPr>
+        <w:ind w:left="3600" w:hanging="360"/>
+      </w:pPr>
+      <w:rPr>
+        <w:rFonts w:ascii="Courier New" w:hAnsi="Courier New" w:cs="Courier New" w:hint="default"/>
+      </w:rPr>
+    </w:lvl>
+    <w:lvl w:ilvl="5" w:tplc="08090005" w:tentative="1">
+      <w:start w:val="1"/>
+      <w:numFmt w:val="bullet"/>
+      <w:lvlText w:val=""/>
+      <w:lvlJc w:val="left"/>
+      <w:pPr>
+        <w:ind w:left="4320" w:hanging="360"/>
+      </w:pPr>
+      <w:rPr>
+        <w:rFonts w:ascii="Wingdings" w:hAnsi="Wingdings" w:hint="default"/>
+      </w:rPr>
+    </w:lvl>
+    <w:lvl w:ilvl="6" w:tplc="08090001" w:tentative="1">
+      <w:start w:val="1"/>
+      <w:numFmt w:val="bullet"/>
+      <w:lvlText w:val=""/>
+      <w:lvlJc w:val="left"/>
+      <w:pPr>
+        <w:ind w:left="5040" w:hanging="360"/>
+      </w:pPr>
+      <w:rPr>
+        <w:rFonts w:ascii="Symbol" w:hAnsi="Symbol" w:hint="default"/>
+      </w:rPr>
+    </w:lvl>
+    <w:lvl w:ilvl="7" w:tplc="08090003" w:tentative="1">
+      <w:start w:val="1"/>
+      <w:numFmt w:val="bullet"/>
+      <w:lvlText w:val="o"/>
+      <w:lvlJc w:val="left"/>
+      <w:pPr>
+        <w:ind w:left="5760" w:hanging="360"/>
+      </w:pPr>
+      <w:rPr>
+        <w:rFonts w:ascii="Courier New" w:hAnsi="Courier New" w:cs="Courier New" w:hint="default"/>
+      </w:rPr>
+    </w:lvl>
+    <w:lvl w:ilvl="8" w:tplc="08090005" w:tentative="1">
+      <w:start w:val="1"/>
+      <w:numFmt w:val="bullet"/>
+      <w:lvlText w:val=""/>
+      <w:lvlJc w:val="left"/>
+      <w:pPr>
+        <w:ind w:left="6480" w:hanging="360"/>
+      </w:pPr>
+      <w:rPr>
+        <w:rFonts w:ascii="Wingdings" w:hAnsi="Wingdings" w:hint="default"/>
+      </w:rPr>
+    </w:lvl>
+  </w:abstractNum>
+  <w:num w:numId="1" w16cid:durableId="1173379283">
+    <w:abstractNumId w:val="0"/>
+  </w:num>
+</w:numbering>
 </file>
 
 <file path=word/styles.xml><?xml version="1.0" encoding="utf-8"?>

</xml_diff>